<commit_message>
Backend cleanup complete and optimization pipeline integrated
</commit_message>
<xml_diff>
--- a/backend/tests/integration/output/optimized_resume.docx
+++ b/backend/tests/integration/output/optimized_resume.docx
@@ -104,45 +104,13 @@
         <w:rPr>
           <w:noProof/>
         </w:rPr>
-        <w:drawing>
-          <wp:inline distT="0" distB="0" distL="0" distR="0" wp14:anchorId="019525EC" wp14:editId="6DA7FE8D">
-            <wp:extent cx="108331" cy="84633"/>
-            <wp:effectExtent l="0" t="0" r="6350" b="0"/>
-            <wp:docPr id="1" name="Image 1">
-              <a:hlinkClick xmlns:a="http://schemas.openxmlformats.org/drawingml/2006/main" r:id="rId5"/>
-            </wp:docPr>
-            <wp:cNvGraphicFramePr>
-              <a:graphicFrameLocks xmlns:a="http://schemas.openxmlformats.org/drawingml/2006/main"/>
-            </wp:cNvGraphicFramePr>
-            <a:graphic xmlns:a="http://schemas.openxmlformats.org/drawingml/2006/main">
-              <a:graphicData uri="http://schemas.openxmlformats.org/drawingml/2006/picture">
-                <pic:pic xmlns:pic="http://schemas.openxmlformats.org/drawingml/2006/picture">
-                  <pic:nvPicPr>
-                    <pic:cNvPr id="1" name="Image 1">
-                      <a:hlinkClick r:id="rId5"/>
-                    </pic:cNvPr>
-                    <pic:cNvPicPr/>
-                  </pic:nvPicPr>
-                  <pic:blipFill>
-                    <a:blip r:embed="rId6" cstate="print"/>
-                    <a:stretch>
-                      <a:fillRect/>
-                    </a:stretch>
-                  </pic:blipFill>
-                  <pic:spPr>
-                    <a:xfrm>
-                      <a:off x="0" y="0"/>
-                      <a:ext cx="108331" cy="84633"/>
-                    </a:xfrm>
-                    <a:prstGeom prst="rect">
-                      <a:avLst/>
-                    </a:prstGeom>
-                  </pic:spPr>
-                </pic:pic>
-              </a:graphicData>
-            </a:graphic>
-          </wp:inline>
-        </w:drawing>
+        <w:t>hegderaviteja21@gmail.com</w:t>
+        <w:tab/>
+        <w:t xml:space="preserve"> 8431093708</w:t>
+        <w:tab/>
+        <w:t xml:space="preserve"> Bengaluru   linkedin.com</w:t>
+        <w:tab/>
+        <w:t xml:space="preserve"> github.com</w:t>
       </w:r>
       <w:hyperlink r:id="rId7" w:history="1">
         <w:r>
@@ -159,128 +127,48 @@
         <w:rPr>
           <w:w w:val="110"/>
         </w:rPr>
-        <w:t>@gmail.com</w:t>
-      </w:r>
-      <w:r>
-        <w:tab/>
-      </w:r>
+      </w:r>
+      <w:r/>
       <w:r>
         <w:rPr>
           <w:noProof/>
           <w:position w:val="-2"/>
         </w:rPr>
-        <w:drawing>
-          <wp:inline distT="0" distB="0" distL="0" distR="0" wp14:anchorId="1522B048" wp14:editId="6ED180A9">
-            <wp:extent cx="116926" cy="116577"/>
-            <wp:effectExtent l="0" t="0" r="0" b="0"/>
-            <wp:docPr id="2" name="Image 2"/>
-            <wp:cNvGraphicFramePr>
-              <a:graphicFrameLocks xmlns:a="http://schemas.openxmlformats.org/drawingml/2006/main"/>
-            </wp:cNvGraphicFramePr>
-            <a:graphic xmlns:a="http://schemas.openxmlformats.org/drawingml/2006/main">
-              <a:graphicData uri="http://schemas.openxmlformats.org/drawingml/2006/picture">
-                <pic:pic xmlns:pic="http://schemas.openxmlformats.org/drawingml/2006/picture">
-                  <pic:nvPicPr>
-                    <pic:cNvPr id="2" name="Image 2"/>
-                    <pic:cNvPicPr/>
-                  </pic:nvPicPr>
-                  <pic:blipFill>
-                    <a:blip r:embed="rId8" cstate="print"/>
-                    <a:stretch>
-                      <a:fillRect/>
-                    </a:stretch>
-                  </pic:blipFill>
-                  <pic:spPr>
-                    <a:xfrm>
-                      <a:off x="0" y="0"/>
-                      <a:ext cx="116926" cy="116577"/>
-                    </a:xfrm>
-                    <a:prstGeom prst="rect">
-                      <a:avLst/>
-                    </a:prstGeom>
-                  </pic:spPr>
-                </pic:pic>
-              </a:graphicData>
-            </a:graphic>
-          </wp:inline>
-        </w:drawing>
       </w:r>
       <w:r>
         <w:rPr>
           <w:spacing w:val="40"/>
           <w:w w:val="110"/>
         </w:rPr>
-        <w:t xml:space="preserve"> </w:t>
-      </w:r>
-      <w:r>
-        <w:rPr>
-          <w:w w:val="110"/>
-        </w:rPr>
-        <w:t>8431093708</w:t>
-      </w:r>
-      <w:r>
-        <w:tab/>
-      </w:r>
+      </w:r>
+      <w:r>
+        <w:rPr>
+          <w:w w:val="110"/>
+        </w:rPr>
+      </w:r>
+      <w:r/>
       <w:r>
         <w:rPr>
           <w:noProof/>
           <w:position w:val="-2"/>
         </w:rPr>
-        <w:drawing>
-          <wp:inline distT="0" distB="0" distL="0" distR="0" wp14:anchorId="7641D0AC" wp14:editId="55EF4B4C">
-            <wp:extent cx="95212" cy="123601"/>
-            <wp:effectExtent l="0" t="0" r="0" b="0"/>
-            <wp:docPr id="3" name="Image 3"/>
-            <wp:cNvGraphicFramePr>
-              <a:graphicFrameLocks xmlns:a="http://schemas.openxmlformats.org/drawingml/2006/main"/>
-            </wp:cNvGraphicFramePr>
-            <a:graphic xmlns:a="http://schemas.openxmlformats.org/drawingml/2006/main">
-              <a:graphicData uri="http://schemas.openxmlformats.org/drawingml/2006/picture">
-                <pic:pic xmlns:pic="http://schemas.openxmlformats.org/drawingml/2006/picture">
-                  <pic:nvPicPr>
-                    <pic:cNvPr id="3" name="Image 3"/>
-                    <pic:cNvPicPr/>
-                  </pic:nvPicPr>
-                  <pic:blipFill>
-                    <a:blip r:embed="rId9" cstate="print"/>
-                    <a:stretch>
-                      <a:fillRect/>
-                    </a:stretch>
-                  </pic:blipFill>
-                  <pic:spPr>
-                    <a:xfrm>
-                      <a:off x="0" y="0"/>
-                      <a:ext cx="95212" cy="123601"/>
-                    </a:xfrm>
-                    <a:prstGeom prst="rect">
-                      <a:avLst/>
-                    </a:prstGeom>
-                  </pic:spPr>
-                </pic:pic>
-              </a:graphicData>
-            </a:graphic>
-          </wp:inline>
-        </w:drawing>
       </w:r>
       <w:r>
         <w:rPr>
           <w:spacing w:val="80"/>
           <w:w w:val="110"/>
         </w:rPr>
-        <w:t xml:space="preserve"> </w:t>
-      </w:r>
-      <w:r>
-        <w:rPr>
-          <w:w w:val="110"/>
-        </w:rPr>
-        <w:t>Bengaluru</w:t>
+      </w:r>
+      <w:r>
+        <w:rPr>
+          <w:w w:val="110"/>
+        </w:rPr>
       </w:r>
       <w:r>
         <w:rPr>
           <w:spacing w:val="40"/>
           <w:w w:val="110"/>
         </w:rPr>
-        <w:t xml:space="preserve">  </w:t>
       </w:r>
       <w:r>
         <w:rPr>
@@ -288,52 +176,12 @@
           <w:spacing w:val="-1"/>
           <w:position w:val="-2"/>
         </w:rPr>
-        <w:drawing>
-          <wp:inline distT="0" distB="0" distL="0" distR="0" wp14:anchorId="58288357" wp14:editId="6ABEB2C5">
-            <wp:extent cx="126950" cy="123824"/>
-            <wp:effectExtent l="0" t="0" r="6985" b="0"/>
-            <wp:docPr id="4" name="Image 4">
-              <a:hlinkClick xmlns:a="http://schemas.openxmlformats.org/drawingml/2006/main" r:id="rId10"/>
-            </wp:docPr>
-            <wp:cNvGraphicFramePr>
-              <a:graphicFrameLocks xmlns:a="http://schemas.openxmlformats.org/drawingml/2006/main"/>
-            </wp:cNvGraphicFramePr>
-            <a:graphic xmlns:a="http://schemas.openxmlformats.org/drawingml/2006/main">
-              <a:graphicData uri="http://schemas.openxmlformats.org/drawingml/2006/picture">
-                <pic:pic xmlns:pic="http://schemas.openxmlformats.org/drawingml/2006/picture">
-                  <pic:nvPicPr>
-                    <pic:cNvPr id="4" name="Image 4">
-                      <a:hlinkClick r:id="rId10"/>
-                    </pic:cNvPr>
-                    <pic:cNvPicPr/>
-                  </pic:nvPicPr>
-                  <pic:blipFill>
-                    <a:blip r:embed="rId11" cstate="print"/>
-                    <a:stretch>
-                      <a:fillRect/>
-                    </a:stretch>
-                  </pic:blipFill>
-                  <pic:spPr>
-                    <a:xfrm>
-                      <a:off x="0" y="0"/>
-                      <a:ext cx="126950" cy="123824"/>
-                    </a:xfrm>
-                    <a:prstGeom prst="rect">
-                      <a:avLst/>
-                    </a:prstGeom>
-                  </pic:spPr>
-                </pic:pic>
-              </a:graphicData>
-            </a:graphic>
-          </wp:inline>
-        </w:drawing>
       </w:r>
       <w:r>
         <w:rPr>
           <w:spacing w:val="78"/>
           <w:w w:val="110"/>
         </w:rPr>
-        <w:t xml:space="preserve"> </w:t>
       </w:r>
       <w:hyperlink r:id="rId12" w:history="1">
         <w:r>
@@ -346,60 +194,18 @@
           <w:t>linkedin.com</w:t>
         </w:r>
       </w:hyperlink>
-      <w:r>
-        <w:tab/>
-      </w:r>
+      <w:r/>
       <w:r>
         <w:rPr>
           <w:noProof/>
           <w:position w:val="-2"/>
         </w:rPr>
-        <w:drawing>
-          <wp:inline distT="0" distB="0" distL="0" distR="0" wp14:anchorId="2B9A381C" wp14:editId="6BDB5E04">
-            <wp:extent cx="123824" cy="122253"/>
-            <wp:effectExtent l="0" t="0" r="0" b="0"/>
-            <wp:docPr id="5" name="Image 5">
-              <a:hlinkClick xmlns:a="http://schemas.openxmlformats.org/drawingml/2006/main" r:id="rId13"/>
-            </wp:docPr>
-            <wp:cNvGraphicFramePr>
-              <a:graphicFrameLocks xmlns:a="http://schemas.openxmlformats.org/drawingml/2006/main"/>
-            </wp:cNvGraphicFramePr>
-            <a:graphic xmlns:a="http://schemas.openxmlformats.org/drawingml/2006/main">
-              <a:graphicData uri="http://schemas.openxmlformats.org/drawingml/2006/picture">
-                <pic:pic xmlns:pic="http://schemas.openxmlformats.org/drawingml/2006/picture">
-                  <pic:nvPicPr>
-                    <pic:cNvPr id="5" name="Image 5">
-                      <a:hlinkClick r:id="rId13"/>
-                    </pic:cNvPr>
-                    <pic:cNvPicPr/>
-                  </pic:nvPicPr>
-                  <pic:blipFill>
-                    <a:blip r:embed="rId14" cstate="print"/>
-                    <a:stretch>
-                      <a:fillRect/>
-                    </a:stretch>
-                  </pic:blipFill>
-                  <pic:spPr>
-                    <a:xfrm>
-                      <a:off x="0" y="0"/>
-                      <a:ext cx="123824" cy="122253"/>
-                    </a:xfrm>
-                    <a:prstGeom prst="rect">
-                      <a:avLst/>
-                    </a:prstGeom>
-                  </pic:spPr>
-                </pic:pic>
-              </a:graphicData>
-            </a:graphic>
-          </wp:inline>
-        </w:drawing>
       </w:r>
       <w:r>
         <w:rPr>
           <w:spacing w:val="40"/>
           <w:w w:val="110"/>
         </w:rPr>
-        <w:t xml:space="preserve"> </w:t>
       </w:r>
       <w:hyperlink r:id="rId15">
         <w:r>
@@ -432,6 +238,7 @@
           <w:rFonts w:asciiTheme="minorHAnsi" w:hAnsiTheme="minorHAnsi" w:cstheme="minorHAnsi"/>
           <w:noProof/>
         </w:rPr>
+        <w:t>PROFESSIONAL SUMMARY</w:t>
       </w:r>
       <w:r>
         <w:rPr>
@@ -439,7 +246,6 @@
           <w:spacing w:val="4"/>
           <w:w w:val="105"/>
         </w:rPr>
-        <w:t>PROFESSIONAL</w:t>
       </w:r>
       <w:r>
         <w:rPr>
@@ -447,7 +253,6 @@
           <w:spacing w:val="70"/>
           <w:w w:val="110"/>
         </w:rPr>
-        <w:t xml:space="preserve"> </w:t>
       </w:r>
       <w:r>
         <w:rPr>
@@ -455,7 +260,6 @@
           <w:spacing w:val="-2"/>
           <w:w w:val="110"/>
         </w:rPr>
-        <w:t>SUMMARY</w:t>
       </w:r>
     </w:p>
     <w:p>
@@ -477,7 +281,7 @@
           <w:w w:val="110"/>
           <w:lang w:val="en-IN"/>
         </w:rPr>
-        <w:t>Software Engineer and MCA student with hands-on experience in developing scalable web solutions through academic and internship projects. Strong foundation in Object-Oriented Programming, Data Structures, Database Management Systems, and Software Engineering, with a passion for solving real-world problems and continuously learning modern technologies.</w:t>
+        <w:t>Software Engineer and MCA student with practical experience in developing scalable backend APIs and web solutions through academic and internship projects. Solid understanding of Object-Oriented Programming, Data Structures, Database Management Systems, and Software Engineering principles, with a strong commitment to writing clean code, improving performance, and deploying cloud applications using modern technologies.</w:t>
       </w:r>
     </w:p>
     <w:p>
@@ -502,6 +306,7 @@
           <w:rFonts w:asciiTheme="minorHAnsi" w:hAnsiTheme="minorHAnsi" w:cstheme="minorHAnsi"/>
           <w:noProof/>
         </w:rPr>
+        <w:t>INTERNSHIP EXPERIENCE</w:t>
       </w:r>
       <w:r>
         <w:rPr>
@@ -509,7 +314,6 @@
           <w:spacing w:val="4"/>
           <w:w w:val="105"/>
         </w:rPr>
-        <w:t>INTERNSHIP</w:t>
       </w:r>
       <w:r>
         <w:rPr>
@@ -517,7 +321,6 @@
           <w:spacing w:val="73"/>
           <w:w w:val="105"/>
         </w:rPr>
-        <w:t xml:space="preserve"> </w:t>
       </w:r>
       <w:r>
         <w:rPr>
@@ -525,7 +328,6 @@
           <w:spacing w:val="-2"/>
           <w:w w:val="105"/>
         </w:rPr>
-        <w:t>EXPERIENCE</w:t>
       </w:r>
     </w:p>
     <w:p>
@@ -549,7 +351,9 @@
           <w:sz w:val="21"/>
           <w:szCs w:val="21"/>
         </w:rPr>
-        <w:t>Z</w:t>
+        <w:t>Zenixus E-Learning Pvt Ltd, Full Stack Developer</w:t>
+        <w:tab/>
+        <w:t>02/2024 – 6/2024 | Bengaluru</w:t>
       </w:r>
       <w:r>
         <w:rPr>
@@ -559,7 +363,6 @@
           <w:sz w:val="21"/>
           <w:szCs w:val="21"/>
         </w:rPr>
-        <w:t>e</w:t>
       </w:r>
       <w:r>
         <w:rPr>
@@ -569,7 +372,6 @@
           <w:sz w:val="21"/>
           <w:szCs w:val="21"/>
         </w:rPr>
-        <w:t>n</w:t>
       </w:r>
       <w:r>
         <w:rPr>
@@ -579,7 +381,6 @@
           <w:sz w:val="21"/>
           <w:szCs w:val="21"/>
         </w:rPr>
-        <w:t>i</w:t>
       </w:r>
       <w:r>
         <w:rPr>
@@ -589,7 +390,6 @@
           <w:sz w:val="21"/>
           <w:szCs w:val="21"/>
         </w:rPr>
-        <w:t>xu</w:t>
       </w:r>
       <w:r>
         <w:rPr>
@@ -599,7 +399,6 @@
           <w:sz w:val="21"/>
           <w:szCs w:val="21"/>
         </w:rPr>
-        <w:t>s</w:t>
       </w:r>
       <w:proofErr w:type="spellEnd"/>
       <w:r>
@@ -610,7 +409,6 @@
           <w:sz w:val="21"/>
           <w:szCs w:val="21"/>
         </w:rPr>
-        <w:t xml:space="preserve"> </w:t>
       </w:r>
       <w:r>
         <w:rPr>
@@ -620,7 +418,6 @@
           <w:sz w:val="21"/>
           <w:szCs w:val="21"/>
         </w:rPr>
-        <w:t>E-</w:t>
       </w:r>
       <w:r>
         <w:rPr>
@@ -630,7 +427,6 @@
           <w:sz w:val="21"/>
           <w:szCs w:val="21"/>
         </w:rPr>
-        <w:t>Learning Pvt Ltd</w:t>
       </w:r>
       <w:r>
         <w:rPr>
@@ -639,7 +435,6 @@
           <w:w w:val="105"/>
           <w:sz w:val="20"/>
         </w:rPr>
-        <w:t>,</w:t>
       </w:r>
       <w:r>
         <w:rPr>
@@ -649,7 +444,6 @@
           <w:w w:val="105"/>
           <w:sz w:val="20"/>
         </w:rPr>
-        <w:t xml:space="preserve"> </w:t>
       </w:r>
       <w:r>
         <w:rPr>
@@ -658,7 +452,6 @@
           <w:w w:val="105"/>
           <w:sz w:val="20"/>
         </w:rPr>
-        <w:t>Full</w:t>
       </w:r>
       <w:r>
         <w:rPr>
@@ -668,7 +461,6 @@
           <w:w w:val="105"/>
           <w:sz w:val="20"/>
         </w:rPr>
-        <w:t xml:space="preserve"> </w:t>
       </w:r>
       <w:r>
         <w:rPr>
@@ -677,7 +469,6 @@
           <w:w w:val="105"/>
           <w:sz w:val="20"/>
         </w:rPr>
-        <w:t>Stack</w:t>
       </w:r>
       <w:r>
         <w:rPr>
@@ -687,7 +478,6 @@
           <w:w w:val="105"/>
           <w:sz w:val="20"/>
         </w:rPr>
-        <w:t xml:space="preserve"> </w:t>
       </w:r>
       <w:r>
         <w:rPr>
@@ -697,7 +487,6 @@
           <w:w w:val="105"/>
           <w:sz w:val="20"/>
         </w:rPr>
-        <w:t>Developer</w:t>
       </w:r>
       <w:r>
         <w:rPr>
@@ -705,31 +494,27 @@
           <w:i/>
           <w:sz w:val="20"/>
         </w:rPr>
-        <w:tab/>
-      </w:r>
-      <w:r>
-        <w:rPr>
-          <w:rFonts w:asciiTheme="minorHAnsi" w:hAnsiTheme="minorHAnsi" w:cstheme="minorHAnsi"/>
-          <w:w w:val="110"/>
-          <w:sz w:val="20"/>
-        </w:rPr>
-        <w:t>0</w:t>
-      </w:r>
-      <w:r>
-        <w:rPr>
-          <w:rFonts w:asciiTheme="minorHAnsi" w:hAnsiTheme="minorHAnsi" w:cstheme="minorHAnsi"/>
-          <w:w w:val="110"/>
-          <w:sz w:val="20"/>
-        </w:rPr>
-        <w:t>2</w:t>
-      </w:r>
-      <w:r>
-        <w:rPr>
-          <w:rFonts w:asciiTheme="minorHAnsi" w:hAnsiTheme="minorHAnsi" w:cstheme="minorHAnsi"/>
-          <w:w w:val="110"/>
-          <w:sz w:val="20"/>
-        </w:rPr>
-        <w:t>/2024</w:t>
+      </w:r>
+      <w:r>
+        <w:rPr>
+          <w:rFonts w:asciiTheme="minorHAnsi" w:hAnsiTheme="minorHAnsi" w:cstheme="minorHAnsi"/>
+          <w:w w:val="110"/>
+          <w:sz w:val="20"/>
+        </w:rPr>
+      </w:r>
+      <w:r>
+        <w:rPr>
+          <w:rFonts w:asciiTheme="minorHAnsi" w:hAnsiTheme="minorHAnsi" w:cstheme="minorHAnsi"/>
+          <w:w w:val="110"/>
+          <w:sz w:val="20"/>
+        </w:rPr>
+      </w:r>
+      <w:r>
+        <w:rPr>
+          <w:rFonts w:asciiTheme="minorHAnsi" w:hAnsiTheme="minorHAnsi" w:cstheme="minorHAnsi"/>
+          <w:w w:val="110"/>
+          <w:sz w:val="20"/>
+        </w:rPr>
       </w:r>
       <w:r>
         <w:rPr>
@@ -738,15 +523,13 @@
           <w:w w:val="110"/>
           <w:sz w:val="20"/>
         </w:rPr>
-        <w:t xml:space="preserve"> </w:t>
-      </w:r>
-      <w:r>
-        <w:rPr>
-          <w:rFonts w:asciiTheme="minorHAnsi" w:hAnsiTheme="minorHAnsi" w:cstheme="minorHAnsi"/>
-          <w:w w:val="110"/>
-          <w:sz w:val="20"/>
-        </w:rPr>
-        <w:t>–</w:t>
+      </w:r>
+      <w:r>
+        <w:rPr>
+          <w:rFonts w:asciiTheme="minorHAnsi" w:hAnsiTheme="minorHAnsi" w:cstheme="minorHAnsi"/>
+          <w:w w:val="110"/>
+          <w:sz w:val="20"/>
+        </w:rPr>
       </w:r>
       <w:r>
         <w:rPr>
@@ -755,31 +538,27 @@
           <w:w w:val="110"/>
           <w:sz w:val="20"/>
         </w:rPr>
-        <w:t xml:space="preserve"> </w:t>
-      </w:r>
-      <w:r>
-        <w:rPr>
-          <w:rFonts w:asciiTheme="minorHAnsi" w:hAnsiTheme="minorHAnsi" w:cstheme="minorHAnsi"/>
-          <w:w w:val="110"/>
-          <w:sz w:val="20"/>
-        </w:rPr>
-        <w:t>6</w:t>
-      </w:r>
-      <w:r>
-        <w:rPr>
-          <w:rFonts w:asciiTheme="minorHAnsi" w:hAnsiTheme="minorHAnsi" w:cstheme="minorHAnsi"/>
-          <w:w w:val="110"/>
-          <w:sz w:val="20"/>
-        </w:rPr>
-        <w:t>/202</w:t>
-      </w:r>
-      <w:r>
-        <w:rPr>
-          <w:rFonts w:asciiTheme="minorHAnsi" w:hAnsiTheme="minorHAnsi" w:cstheme="minorHAnsi"/>
-          <w:w w:val="110"/>
-          <w:sz w:val="20"/>
-        </w:rPr>
-        <w:t>4</w:t>
+      </w:r>
+      <w:r>
+        <w:rPr>
+          <w:rFonts w:asciiTheme="minorHAnsi" w:hAnsiTheme="minorHAnsi" w:cstheme="minorHAnsi"/>
+          <w:w w:val="110"/>
+          <w:sz w:val="20"/>
+        </w:rPr>
+      </w:r>
+      <w:r>
+        <w:rPr>
+          <w:rFonts w:asciiTheme="minorHAnsi" w:hAnsiTheme="minorHAnsi" w:cstheme="minorHAnsi"/>
+          <w:w w:val="110"/>
+          <w:sz w:val="20"/>
+        </w:rPr>
+      </w:r>
+      <w:r>
+        <w:rPr>
+          <w:rFonts w:asciiTheme="minorHAnsi" w:hAnsiTheme="minorHAnsi" w:cstheme="minorHAnsi"/>
+          <w:w w:val="110"/>
+          <w:sz w:val="20"/>
+        </w:rPr>
       </w:r>
       <w:r>
         <w:rPr>
@@ -788,15 +567,13 @@
           <w:w w:val="110"/>
           <w:sz w:val="20"/>
         </w:rPr>
-        <w:t xml:space="preserve"> </w:t>
-      </w:r>
-      <w:r>
-        <w:rPr>
-          <w:rFonts w:asciiTheme="minorHAnsi" w:hAnsiTheme="minorHAnsi" w:cstheme="minorHAnsi"/>
-          <w:w w:val="110"/>
-          <w:sz w:val="20"/>
-        </w:rPr>
-        <w:t>|</w:t>
+      </w:r>
+      <w:r>
+        <w:rPr>
+          <w:rFonts w:asciiTheme="minorHAnsi" w:hAnsiTheme="minorHAnsi" w:cstheme="minorHAnsi"/>
+          <w:w w:val="110"/>
+          <w:sz w:val="20"/>
+        </w:rPr>
       </w:r>
       <w:r>
         <w:rPr>
@@ -805,7 +582,6 @@
           <w:w w:val="110"/>
           <w:sz w:val="20"/>
         </w:rPr>
-        <w:t xml:space="preserve"> </w:t>
       </w:r>
       <w:r>
         <w:rPr>
@@ -814,7 +590,6 @@
           <w:w w:val="110"/>
           <w:sz w:val="20"/>
         </w:rPr>
-        <w:t>Bengaluru</w:t>
       </w:r>
     </w:p>
     <w:p>
@@ -840,21 +615,19 @@
           <w:rFonts w:asciiTheme="minorHAnsi" w:hAnsiTheme="minorHAnsi" w:cstheme="minorHAnsi"/>
           <w:sz w:val="20"/>
         </w:rPr>
-        <w:t xml:space="preserve">Developed enterprise web applications using Angular, TypeScript, Node.js, JWT Authentication, MySQL, and REST APIs </w:t>
-      </w:r>
-      <w:r>
-        <w:rPr>
-          <w:rFonts w:asciiTheme="minorHAnsi" w:hAnsiTheme="minorHAnsi" w:cstheme="minorHAnsi"/>
-          <w:sz w:val="20"/>
-        </w:rPr>
-        <w:t xml:space="preserve">    </w:t>
-      </w:r>
-      <w:r>
-        <w:rPr>
-          <w:rFonts w:asciiTheme="minorHAnsi" w:hAnsiTheme="minorHAnsi" w:cstheme="minorHAnsi"/>
-          <w:sz w:val="20"/>
-        </w:rPr>
-        <w:t>following the MVC architecture.</w:t>
+        <w:t>Developed backend web applications using Python, FastAPI, REST APIs, PostgreSQL, and JWT Authentication, following the MVC architecture to build scalable and efficient systems.</w:t>
+      </w:r>
+      <w:r>
+        <w:rPr>
+          <w:rFonts w:asciiTheme="minorHAnsi" w:hAnsiTheme="minorHAnsi" w:cstheme="minorHAnsi"/>
+          <w:sz w:val="20"/>
+        </w:rPr>
+      </w:r>
+      <w:r>
+        <w:rPr>
+          <w:rFonts w:asciiTheme="minorHAnsi" w:hAnsiTheme="minorHAnsi" w:cstheme="minorHAnsi"/>
+          <w:sz w:val="20"/>
+        </w:rPr>
       </w:r>
     </w:p>
     <w:p>
@@ -882,15 +655,14 @@
           <w:sz w:val="20"/>
           <w:szCs w:val="20"/>
         </w:rPr>
-        <w:t>Implemented RESTful APIs using Node.js and integrated them seamlessly with Angular front-end applications to ensure efficient data flow and improved user experience</w:t>
-      </w:r>
-      <w:r>
-        <w:rPr>
-          <w:rFonts w:asciiTheme="minorHAnsi" w:hAnsiTheme="minorHAnsi" w:cstheme="minorHAnsi"/>
-          <w:w w:val="110"/>
-          <w:sz w:val="20"/>
-        </w:rPr>
-        <w:t>.</w:t>
+        <w:t>Developed RESTful APIs using Python and FastAPI, ensuring efficient data flow and seamless integration with front-end applications to enhance overall user experience.</w:t>
+      </w:r>
+      <w:r>
+        <w:rPr>
+          <w:rFonts w:asciiTheme="minorHAnsi" w:hAnsiTheme="minorHAnsi" w:cstheme="minorHAnsi"/>
+          <w:w w:val="110"/>
+          <w:sz w:val="20"/>
+        </w:rPr>
       </w:r>
     </w:p>
     <w:p>
@@ -918,7 +690,7 @@
           <w:szCs w:val="20"/>
           <w:lang w:val="en-IN" w:eastAsia="en-IN"/>
         </w:rPr>
-        <w:t>Collaborated with development teams to identify and resolve issues, improve code quality, and enhance overall application performance and reliability.</w:t>
+        <w:t>Collaborated with development teams to identify and resolve issues, improve code quality, and enhance the performance and scalability of backend APIs, ensuring reliable cloud application deployment.</w:t>
       </w:r>
     </w:p>
     <w:p>
@@ -969,6 +741,7 @@
           <w:rFonts w:asciiTheme="minorHAnsi" w:hAnsiTheme="minorHAnsi" w:cstheme="minorHAnsi"/>
           <w:noProof/>
         </w:rPr>
+        <w:t>PROJECTS</w:t>
       </w:r>
       <w:r>
         <w:rPr>
@@ -976,7 +749,6 @@
           <w:spacing w:val="-2"/>
           <w:w w:val="105"/>
         </w:rPr>
-        <w:t>PROJECTS</w:t>
       </w:r>
     </w:p>
     <w:p>
@@ -1046,7 +818,7 @@
           <w:bCs w:val="0"/>
           <w:w w:val="110"/>
         </w:rPr>
-        <w:t>Developed a responsive Dairy Management System to streamline customer subscriptions, product catalog, inventory management, and milk delivery operations. Designed reusable Angular components, implemented routing, reactive forms, CRUD operations, authentication, and REST API integration to enhance operational efficiency and provide a seamless user experience using a component-based architectu</w:t>
+        <w:t>Developed a backend system to streamline customer subscriptions, product catalog, inventory management, and delivery operations. Implemented REST API endpoints using Python and FastAPI to enhance operational efficiency and ensure seamless integration with frontend components. Focused on writing clean, scalable code and improving system performance while supporting deployment through Docker and AWS cloud services.</w:t>
       </w:r>
       <w:r>
         <w:rPr>
@@ -1055,7 +827,6 @@
           <w:bCs w:val="0"/>
           <w:w w:val="110"/>
         </w:rPr>
-        <w:t>re.</w:t>
       </w:r>
     </w:p>
     <w:p>
@@ -1077,7 +848,7 @@
           <w:sz w:val="21"/>
           <w:szCs w:val="21"/>
         </w:rPr>
-        <w:t>Farm</w:t>
+        <w:t>Farm Product Supply Chain Management</w:t>
       </w:r>
       <w:r>
         <w:rPr>
@@ -1087,7 +858,6 @@
           <w:sz w:val="21"/>
           <w:szCs w:val="21"/>
         </w:rPr>
-        <w:t xml:space="preserve"> </w:t>
       </w:r>
       <w:r>
         <w:rPr>
@@ -1096,7 +866,6 @@
           <w:sz w:val="21"/>
           <w:szCs w:val="21"/>
         </w:rPr>
-        <w:t>Product</w:t>
       </w:r>
       <w:r>
         <w:rPr>
@@ -1106,7 +875,6 @@
           <w:sz w:val="21"/>
           <w:szCs w:val="21"/>
         </w:rPr>
-        <w:t xml:space="preserve"> </w:t>
       </w:r>
       <w:r>
         <w:rPr>
@@ -1115,7 +883,6 @@
           <w:sz w:val="21"/>
           <w:szCs w:val="21"/>
         </w:rPr>
-        <w:t>Supply</w:t>
       </w:r>
       <w:r>
         <w:rPr>
@@ -1125,7 +892,6 @@
           <w:sz w:val="21"/>
           <w:szCs w:val="21"/>
         </w:rPr>
-        <w:t xml:space="preserve"> </w:t>
       </w:r>
       <w:r>
         <w:rPr>
@@ -1134,7 +900,6 @@
           <w:sz w:val="21"/>
           <w:szCs w:val="21"/>
         </w:rPr>
-        <w:t>Chain</w:t>
       </w:r>
       <w:r>
         <w:rPr>
@@ -1144,7 +909,6 @@
           <w:sz w:val="21"/>
           <w:szCs w:val="21"/>
         </w:rPr>
-        <w:t xml:space="preserve"> </w:t>
       </w:r>
       <w:r>
         <w:rPr>
@@ -1154,7 +918,6 @@
           <w:sz w:val="21"/>
           <w:szCs w:val="21"/>
         </w:rPr>
-        <w:t>Management</w:t>
       </w:r>
     </w:p>
     <w:p>
@@ -1197,7 +960,7 @@
           <w:bCs w:val="0"/>
           <w:w w:val="110"/>
         </w:rPr>
-        <w:t xml:space="preserve">Developed a responsive Farm Product Supply Chain Management System to streamline agricultural product tracking from farmers to consumers. Designed reusable Angular components, implemented routing, reactive forms, form validation, CRUD operations, REST API integration, inventory management, order processing, real-time shipment tracking, dashboard modules, search and filtering, and responsive user interfaces to improve supply chain visibility, </w:t>
+        <w:t>Developed a backend system for Farm Product Supply Chain Management to enhance agricultural product tracking from farmers to consumers. Built scalable REST APIs using Python and FastAPI, integrated PostgreSQL for inventory management and order processing, and ensured clean, maintainable code. Improved system performance and deployed the application on AWS using Docker containers with CI/CD pipelines to support real-time shipment tracking and operational efficiency.</w:t>
       </w:r>
       <w:r>
         <w:rPr>
@@ -1206,7 +969,6 @@
           <w:bCs w:val="0"/>
           <w:w w:val="110"/>
         </w:rPr>
-        <w:t>end-to-end product traceability</w:t>
       </w:r>
       <w:r>
         <w:rPr>
@@ -1215,7 +977,6 @@
           <w:bCs w:val="0"/>
           <w:w w:val="110"/>
         </w:rPr>
-        <w:t>, and operational efficiency.</w:t>
       </w:r>
     </w:p>
     <w:p>
@@ -1239,7 +1000,7 @@
           <w:sz w:val="21"/>
           <w:szCs w:val="21"/>
         </w:rPr>
-        <w:t>LetsExplore</w:t>
+        <w:t>LetsExplore: Tourism Management Application</w:t>
       </w:r>
       <w:proofErr w:type="spellEnd"/>
       <w:r>
@@ -1251,7 +1012,6 @@
           <w:sz w:val="21"/>
           <w:szCs w:val="21"/>
         </w:rPr>
-        <w:t>: Tourism Management Application</w:t>
       </w:r>
       <w:r>
         <w:rPr>
@@ -1263,7 +1023,6 @@
           <w:sz w:val="21"/>
           <w:szCs w:val="21"/>
         </w:rPr>
-        <w:t xml:space="preserve"> </w:t>
       </w:r>
     </w:p>
     <w:p>
@@ -1286,7 +1045,7 @@
           <w:bCs/>
           <w:w w:val="105"/>
         </w:rPr>
-        <w:t xml:space="preserve">Angular • TypeScript • Node.js • MySQL • REST APIs • HTML5 • CSS3 • </w:t>
+        <w:t>Angular • TypeScript • Node.js • MySQL • REST APIs • HTML5 • CSS3 • WebSockets • Git</w:t>
       </w:r>
       <w:proofErr w:type="spellStart"/>
       <w:r>
@@ -1296,7 +1055,6 @@
           <w:bCs/>
           <w:w w:val="105"/>
         </w:rPr>
-        <w:t>WebSockets</w:t>
       </w:r>
       <w:proofErr w:type="spellEnd"/>
       <w:r>
@@ -1306,7 +1064,6 @@
           <w:bCs/>
           <w:w w:val="105"/>
         </w:rPr>
-        <w:t xml:space="preserve"> • Git</w:t>
       </w:r>
     </w:p>
     <w:p>
@@ -1326,7 +1083,7 @@
           <w:rFonts w:asciiTheme="minorHAnsi" w:hAnsiTheme="minorHAnsi" w:cstheme="minorHAnsi"/>
           <w:w w:val="110"/>
         </w:rPr>
-        <w:t xml:space="preserve">Developed a full-stack Tourism Management System to simplify destination discovery, trip planning, and online booking. Implemented user authentication, destination management, booking management, shopping cart, admin dashboard, CRUD operations, REST API integration, real-time notifications using </w:t>
+        <w:t>Developed a backend system for a Tourism Management application focusing on scalable API design and performance optimization. Implemented RESTful APIs with secure user authentication, destination and booking management, and role-based access control. Utilized clean code principles and integrated real-time notifications using WebSockets. Ensured maintainability and scalability by following MVC architecture and deploying the application with Docker and cloud services.</w:t>
       </w:r>
       <w:proofErr w:type="spellStart"/>
       <w:r>
@@ -1334,7 +1091,6 @@
           <w:rFonts w:asciiTheme="minorHAnsi" w:hAnsiTheme="minorHAnsi" w:cstheme="minorHAnsi"/>
           <w:w w:val="110"/>
         </w:rPr>
-        <w:t>WebSockets</w:t>
       </w:r>
       <w:proofErr w:type="spellEnd"/>
       <w:r>
@@ -1342,7 +1098,6 @@
           <w:rFonts w:asciiTheme="minorHAnsi" w:hAnsiTheme="minorHAnsi" w:cstheme="minorHAnsi"/>
           <w:w w:val="110"/>
         </w:rPr>
-        <w:t>, responsive user interfaces, and role-based access control following the MVC architecture to deliver a scalable and maintainable web application.</w:t>
       </w:r>
     </w:p>
     <w:p>
@@ -1370,6 +1125,7 @@
           <w:rFonts w:asciiTheme="minorHAnsi" w:hAnsiTheme="minorHAnsi" w:cstheme="minorHAnsi"/>
           <w:noProof/>
         </w:rPr>
+        <w:t>SKILLS</w:t>
       </w:r>
       <w:r>
         <w:rPr>
@@ -1377,7 +1133,6 @@
           <w:spacing w:val="-2"/>
           <w:w w:val="105"/>
         </w:rPr>
-        <w:t>SKILLS</w:t>
       </w:r>
     </w:p>
     <w:p>
@@ -1398,7 +1153,7 @@
           <w:bCs/>
           <w:lang w:val="en-IN"/>
         </w:rPr>
-        <w:t>Frontend</w:t>
+        <w:t>Frontend Technologies: JavaScript (ES6+), TypeScript (ES6+), Responsive Web Design</w:t>
       </w:r>
       <w:r>
         <w:rPr>
@@ -1407,7 +1162,6 @@
           <w:bCs/>
           <w:lang w:val="en-IN"/>
         </w:rPr>
-        <w:t xml:space="preserve"> </w:t>
       </w:r>
       <w:r>
         <w:rPr>
@@ -1415,7 +1169,6 @@
           <w:b/>
           <w:bCs/>
         </w:rPr>
-        <w:t>Technologies</w:t>
       </w:r>
       <w:r>
         <w:rPr>
@@ -1424,14 +1177,12 @@
           <w:bCs/>
           <w:lang w:val="en-IN"/>
         </w:rPr>
-        <w:t>:</w:t>
       </w:r>
       <w:r>
         <w:rPr>
           <w:rFonts w:asciiTheme="minorHAnsi" w:hAnsiTheme="minorHAnsi" w:cstheme="minorHAnsi"/>
           <w:lang w:val="en-IN"/>
         </w:rPr>
-        <w:t xml:space="preserve"> Angular, TypeScript (ES6+), JavaScript (ES6+), HTML5, CSS3, Responsive Web Design</w:t>
       </w:r>
     </w:p>
     <w:p>
@@ -1452,7 +1203,7 @@
           <w:bCs/>
           <w:lang w:val="en-IN"/>
         </w:rPr>
-        <w:t>Backend</w:t>
+        <w:t>Backend Technologies: FastAPI, Python, Node.js, JWT Authentication, REST API</w:t>
       </w:r>
       <w:r>
         <w:rPr>
@@ -1461,7 +1212,6 @@
           <w:bCs/>
           <w:lang w:val="en-IN"/>
         </w:rPr>
-        <w:t xml:space="preserve"> </w:t>
       </w:r>
       <w:r>
         <w:rPr>
@@ -1470,7 +1220,6 @@
           <w:bCs/>
           <w:lang w:val="en-IN"/>
         </w:rPr>
-        <w:t>Technologies</w:t>
       </w:r>
       <w:r>
         <w:rPr>
@@ -1479,14 +1228,12 @@
           <w:bCs/>
           <w:lang w:val="en-IN"/>
         </w:rPr>
-        <w:t>:</w:t>
       </w:r>
       <w:r>
         <w:rPr>
           <w:rFonts w:asciiTheme="minorHAnsi" w:hAnsiTheme="minorHAnsi" w:cstheme="minorHAnsi"/>
           <w:lang w:val="en-IN"/>
         </w:rPr>
-        <w:t xml:space="preserve"> Node.js, REST APIs, JWT Authentication, Spring Boot (Basics)</w:t>
       </w:r>
     </w:p>
     <w:p>
@@ -1507,14 +1254,13 @@
           <w:bCs/>
           <w:lang w:val="en-IN"/>
         </w:rPr>
-        <w:t>Database:</w:t>
+        <w:t>Databases: MySQL, PostgreSQL, SQL</w:t>
       </w:r>
       <w:r>
         <w:rPr>
           <w:rFonts w:asciiTheme="minorHAnsi" w:hAnsiTheme="minorHAnsi" w:cstheme="minorHAnsi"/>
           <w:lang w:val="en-IN"/>
         </w:rPr>
-        <w:t xml:space="preserve"> MySQL, PostgreSQL, SQL</w:t>
       </w:r>
     </w:p>
     <w:p>
@@ -1535,21 +1281,19 @@
           <w:bCs/>
           <w:lang w:val="en-IN"/>
         </w:rPr>
-        <w:t>Programming Languages:</w:t>
+        <w:t>Tools &amp; Platforms: Git, GitHub, Postman, Swagger</w:t>
       </w:r>
       <w:r>
         <w:rPr>
           <w:rFonts w:asciiTheme="minorHAnsi" w:hAnsiTheme="minorHAnsi" w:cstheme="minorHAnsi"/>
           <w:lang w:val="en-IN"/>
         </w:rPr>
-        <w:t xml:space="preserve"> Java, Python, C, C++</w:t>
       </w:r>
       <w:r>
         <w:rPr>
           <w:rFonts w:asciiTheme="minorHAnsi" w:hAnsiTheme="minorHAnsi" w:cstheme="minorHAnsi"/>
           <w:lang w:val="en-IN"/>
         </w:rPr>
-        <w:t>, C#.net</w:t>
       </w:r>
     </w:p>
     <w:p>
@@ -1570,14 +1314,13 @@
           <w:bCs/>
           <w:lang w:val="en-IN"/>
         </w:rPr>
-        <w:t>Tools &amp; Platforms:</w:t>
+        <w:t>Cloud &amp; DevOps: AWS, CI/CD, Docker</w:t>
       </w:r>
       <w:r>
         <w:rPr>
           <w:rFonts w:asciiTheme="minorHAnsi" w:hAnsiTheme="minorHAnsi" w:cstheme="minorHAnsi"/>
           <w:lang w:val="en-IN"/>
         </w:rPr>
-        <w:t xml:space="preserve"> Git, GitHub, Firebase, Postman, Swagger</w:t>
       </w:r>
     </w:p>
     <w:p>
@@ -1606,6 +1349,7 @@
           <w:rFonts w:asciiTheme="minorHAnsi" w:hAnsiTheme="minorHAnsi" w:cstheme="minorHAnsi"/>
           <w:noProof/>
         </w:rPr>
+        <w:t>EDUCATION</w:t>
       </w:r>
       <w:r>
         <w:rPr>
@@ -1613,7 +1357,6 @@
           <w:spacing w:val="-2"/>
           <w:w w:val="105"/>
         </w:rPr>
-        <w:t>EDUCATION</w:t>
       </w:r>
     </w:p>
     <w:p>
@@ -1652,36 +1395,34 @@
           <w:w w:val="105"/>
         </w:rPr>
         <w:t>Master of Computer Applications (MCA)</w:t>
-      </w:r>
-      <w:r>
-        <w:rPr>
-          <w:rFonts w:asciiTheme="minorHAnsi" w:hAnsiTheme="minorHAnsi" w:cstheme="minorHAnsi"/>
-          <w:w w:val="105"/>
-        </w:rPr>
         <w:br/>
         <w:t>KLE Institute of Technology, Hubballi, Karnataka</w:t>
-      </w:r>
-      <w:r>
-        <w:rPr>
-          <w:rFonts w:asciiTheme="minorHAnsi" w:hAnsiTheme="minorHAnsi" w:cstheme="minorHAnsi"/>
-          <w:w w:val="105"/>
-        </w:rPr>
         <w:br/>
-        <w:t xml:space="preserve">CGPA: 8.20/10 | </w:t>
-      </w:r>
-      <w:r>
-        <w:rPr>
-          <w:rFonts w:asciiTheme="minorHAnsi" w:hAnsiTheme="minorHAnsi" w:cstheme="minorHAnsi"/>
-          <w:w w:val="105"/>
-        </w:rPr>
-        <w:t>June</w:t>
-      </w:r>
-      <w:r>
-        <w:rPr>
-          <w:rFonts w:asciiTheme="minorHAnsi" w:hAnsiTheme="minorHAnsi" w:cstheme="minorHAnsi"/>
-          <w:w w:val="105"/>
-        </w:rPr>
-        <w:t xml:space="preserve"> 2026</w:t>
+        <w:t>CGPA: 8.20/10 | June 2026</w:t>
+      </w:r>
+      <w:r>
+        <w:rPr>
+          <w:rFonts w:asciiTheme="minorHAnsi" w:hAnsiTheme="minorHAnsi" w:cstheme="minorHAnsi"/>
+          <w:w w:val="105"/>
+        </w:rPr>
+      </w:r>
+      <w:r>
+        <w:rPr>
+          <w:rFonts w:asciiTheme="minorHAnsi" w:hAnsiTheme="minorHAnsi" w:cstheme="minorHAnsi"/>
+          <w:w w:val="105"/>
+        </w:rPr>
+      </w:r>
+      <w:r>
+        <w:rPr>
+          <w:rFonts w:asciiTheme="minorHAnsi" w:hAnsiTheme="minorHAnsi" w:cstheme="minorHAnsi"/>
+          <w:w w:val="105"/>
+        </w:rPr>
+      </w:r>
+      <w:r>
+        <w:rPr>
+          <w:rFonts w:asciiTheme="minorHAnsi" w:hAnsiTheme="minorHAnsi" w:cstheme="minorHAnsi"/>
+          <w:w w:val="105"/>
+        </w:rPr>
       </w:r>
     </w:p>
     <w:p>
@@ -1702,63 +1443,58 @@
           <w:w w:val="105"/>
         </w:rPr>
         <w:t>Bachelor of Computer Applications (BCA)</w:t>
-      </w:r>
-      <w:r>
-        <w:rPr>
-          <w:rFonts w:asciiTheme="minorHAnsi" w:hAnsiTheme="minorHAnsi" w:cstheme="minorHAnsi"/>
-          <w:w w:val="105"/>
-        </w:rPr>
         <w:br/>
-      </w:r>
-      <w:r>
-        <w:rPr>
-          <w:rFonts w:asciiTheme="minorHAnsi" w:hAnsiTheme="minorHAnsi" w:cstheme="minorHAnsi"/>
-          <w:w w:val="105"/>
-        </w:rPr>
-        <w:t>PES Institute of Technology</w:t>
-      </w:r>
-      <w:r>
-        <w:rPr>
-          <w:rFonts w:asciiTheme="minorHAnsi" w:hAnsiTheme="minorHAnsi" w:cstheme="minorHAnsi"/>
-          <w:w w:val="105"/>
-        </w:rPr>
-        <w:t>, S</w:t>
-      </w:r>
-      <w:r>
-        <w:rPr>
-          <w:rFonts w:asciiTheme="minorHAnsi" w:hAnsiTheme="minorHAnsi" w:cstheme="minorHAnsi"/>
-          <w:w w:val="105"/>
-        </w:rPr>
-        <w:t>hivamogga</w:t>
-      </w:r>
-      <w:r>
-        <w:rPr>
-          <w:rFonts w:asciiTheme="minorHAnsi" w:hAnsiTheme="minorHAnsi" w:cstheme="minorHAnsi"/>
-          <w:w w:val="105"/>
-        </w:rPr>
-        <w:t>, Karnataka</w:t>
-      </w:r>
-      <w:r>
-        <w:rPr>
-          <w:rFonts w:asciiTheme="minorHAnsi" w:hAnsiTheme="minorHAnsi" w:cstheme="minorHAnsi"/>
-          <w:w w:val="105"/>
-        </w:rPr>
+        <w:t>PES Institute of Technology, Shivamogga, Karnataka</w:t>
         <w:br/>
-        <w:t xml:space="preserve">CGPA: </w:t>
-      </w:r>
-      <w:r>
-        <w:rPr>
-          <w:rFonts w:asciiTheme="minorHAnsi" w:hAnsiTheme="minorHAnsi" w:cstheme="minorHAnsi"/>
-          <w:w w:val="105"/>
-        </w:rPr>
-        <w:t>8.92</w:t>
-      </w:r>
-      <w:r>
-        <w:rPr>
-          <w:rFonts w:asciiTheme="minorHAnsi" w:hAnsiTheme="minorHAnsi" w:cstheme="minorHAnsi"/>
-          <w:w w:val="105"/>
-        </w:rPr>
-        <w:t>/10 |2024</w:t>
+        <w:t>CGPA: 8.92/10 |2024</w:t>
+      </w:r>
+      <w:r>
+        <w:rPr>
+          <w:rFonts w:asciiTheme="minorHAnsi" w:hAnsiTheme="minorHAnsi" w:cstheme="minorHAnsi"/>
+          <w:w w:val="105"/>
+        </w:rPr>
+      </w:r>
+      <w:r>
+        <w:rPr>
+          <w:rFonts w:asciiTheme="minorHAnsi" w:hAnsiTheme="minorHAnsi" w:cstheme="minorHAnsi"/>
+          <w:w w:val="105"/>
+        </w:rPr>
+      </w:r>
+      <w:r>
+        <w:rPr>
+          <w:rFonts w:asciiTheme="minorHAnsi" w:hAnsiTheme="minorHAnsi" w:cstheme="minorHAnsi"/>
+          <w:w w:val="105"/>
+        </w:rPr>
+      </w:r>
+      <w:r>
+        <w:rPr>
+          <w:rFonts w:asciiTheme="minorHAnsi" w:hAnsiTheme="minorHAnsi" w:cstheme="minorHAnsi"/>
+          <w:w w:val="105"/>
+        </w:rPr>
+      </w:r>
+      <w:r>
+        <w:rPr>
+          <w:rFonts w:asciiTheme="minorHAnsi" w:hAnsiTheme="minorHAnsi" w:cstheme="minorHAnsi"/>
+          <w:w w:val="105"/>
+        </w:rPr>
+      </w:r>
+      <w:r>
+        <w:rPr>
+          <w:rFonts w:asciiTheme="minorHAnsi" w:hAnsiTheme="minorHAnsi" w:cstheme="minorHAnsi"/>
+          <w:w w:val="105"/>
+        </w:rPr>
+      </w:r>
+      <w:r>
+        <w:rPr>
+          <w:rFonts w:asciiTheme="minorHAnsi" w:hAnsiTheme="minorHAnsi" w:cstheme="minorHAnsi"/>
+          <w:w w:val="105"/>
+        </w:rPr>
+      </w:r>
+      <w:r>
+        <w:rPr>
+          <w:rFonts w:asciiTheme="minorHAnsi" w:hAnsiTheme="minorHAnsi" w:cstheme="minorHAnsi"/>
+          <w:w w:val="105"/>
+        </w:rPr>
       </w:r>
     </w:p>
     <w:p>

</xml_diff>